<commit_message>
adding mean ± std
</commit_message>
<xml_diff>
--- a/cKatarina Milojković - studijsko istraživački rad.docx
+++ b/cKatarina Milojković - studijsko istraživački rad.docx
@@ -8272,7 +8272,7 @@
           <w:szCs w:val="22"/>
           <w:highlight w:val="yellow"/>
         </w:rPr>
-        <w:t>sve tri istraživačke hipoteze potvrđene su samo delimično: prva najjasnije za model optimizovan standardnom stratifikovanom K-strukom unakrsnom validacijom, treća nije potvrđena (standardna varijanta je, po prvi put u ovom istraživanju, dala bolji model od ponovljene), a druga samo u pogledu delimičnog slaganja dve mere važnosti obeležja. Svi rezultati su blizu nivoa slučajnog pogađanja, a razlike među modelima nisu statistički pouzdane.</w:t>
+        <w:t>prva istraživačka hipoteza nije potvrđena kada se testira preko ponovljenih spoljašnjih podela umesto na jednoj fiksnoj podeli (odeljak Ponovljene spoljašnje podele); treća takođe nije potvrđena, ali dosledno, u istom smeru i na jedinoj podeli i preko 15 ponovljenih podela — standardna stratifikovana K-struka daje robusniji model od ponovljene; druga je potvrđena samo u pogledu delimičnog slaganja dve mere važnosti obeležja. Svi rezultati su blizu nivoa slučajnog pogađanja, a razlike među modelima nisu statistički pouzdane.</w:t>
       </w:r>
       <w:r>
         <w:rPr>
@@ -33273,8 +33273,8 @@
             <w:r>
               <w:drawing>
                 <wp:inline xmlns:a="http://schemas.openxmlformats.org/drawingml/2006/main" xmlns:pic="http://schemas.openxmlformats.org/drawingml/2006/picture">
-                  <wp:extent cx="1874519" cy="1384686"/>
-                  <wp:docPr id="1987301640" name="Picture 1987301640"/>
+                  <wp:extent cx="1874519" cy="1359905"/>
+                  <wp:docPr id="1987301659" name="Picture 1987301659"/>
                   <wp:cNvGraphicFramePr>
                     <a:graphicFrameLocks noChangeAspect="1"/>
                   </wp:cNvGraphicFramePr>
@@ -33282,11 +33282,11 @@
                     <a:graphicData uri="http://schemas.openxmlformats.org/drawingml/2006/picture">
                       <pic:pic>
                         <pic:nvPicPr>
-                          <pic:cNvPr id="0" name="download2.png"/>
+                          <pic:cNvPr id="0" name="download2.PNG"/>
                           <pic:cNvPicPr/>
                         </pic:nvPicPr>
                         <pic:blipFill>
-                          <a:blip r:embed="rId51"/>
+                          <a:blip r:embed="rId70"/>
                           <a:stretch>
                             <a:fillRect/>
                           </a:stretch>
@@ -33294,7 +33294,7 @@
                         <pic:spPr>
                           <a:xfrm>
                             <a:off x="0" y="0"/>
-                            <a:ext cx="1874519" cy="1384686"/>
+                            <a:ext cx="1874519" cy="1359905"/>
                           </a:xfrm>
                           <a:prstGeom prst="rect"/>
                         </pic:spPr>
@@ -33315,8 +33315,8 @@
             <w:r>
               <w:drawing>
                 <wp:inline xmlns:a="http://schemas.openxmlformats.org/drawingml/2006/main" xmlns:pic="http://schemas.openxmlformats.org/drawingml/2006/picture">
-                  <wp:extent cx="1874519" cy="1283245"/>
-                  <wp:docPr id="1987301641" name="Picture 1987301641"/>
+                  <wp:extent cx="1874519" cy="1373283"/>
+                  <wp:docPr id="1987301660" name="Picture 1987301660"/>
                   <wp:cNvGraphicFramePr>
                     <a:graphicFrameLocks noChangeAspect="1"/>
                   </wp:cNvGraphicFramePr>
@@ -33324,11 +33324,11 @@
                     <a:graphicData uri="http://schemas.openxmlformats.org/drawingml/2006/picture">
                       <pic:pic>
                         <pic:nvPicPr>
-                          <pic:cNvPr id="0" name="download1.png"/>
+                          <pic:cNvPr id="0" name="download1.PNG"/>
                           <pic:cNvPicPr/>
                         </pic:nvPicPr>
                         <pic:blipFill>
-                          <a:blip r:embed="rId52"/>
+                          <a:blip r:embed="rId71"/>
                           <a:stretch>
                             <a:fillRect/>
                           </a:stretch>
@@ -33336,7 +33336,7 @@
                         <pic:spPr>
                           <a:xfrm>
                             <a:off x="0" y="0"/>
-                            <a:ext cx="1874519" cy="1283245"/>
+                            <a:ext cx="1874519" cy="1373283"/>
                           </a:xfrm>
                           <a:prstGeom prst="rect"/>
                         </pic:spPr>
@@ -33357,8 +33357,8 @@
             <w:r>
               <w:drawing>
                 <wp:inline xmlns:a="http://schemas.openxmlformats.org/drawingml/2006/main" xmlns:pic="http://schemas.openxmlformats.org/drawingml/2006/picture">
-                  <wp:extent cx="1874519" cy="1319682"/>
-                  <wp:docPr id="1987301642" name="Picture 1987301642"/>
+                  <wp:extent cx="1874519" cy="1243229"/>
+                  <wp:docPr id="1987301661" name="Picture 1987301661"/>
                   <wp:cNvGraphicFramePr>
                     <a:graphicFrameLocks noChangeAspect="1"/>
                   </wp:cNvGraphicFramePr>
@@ -33366,11 +33366,11 @@
                     <a:graphicData uri="http://schemas.openxmlformats.org/drawingml/2006/picture">
                       <pic:pic>
                         <pic:nvPicPr>
-                          <pic:cNvPr id="0" name="download1.png"/>
+                          <pic:cNvPr id="0" name="download1.PNG"/>
                           <pic:cNvPicPr/>
                         </pic:nvPicPr>
                         <pic:blipFill>
-                          <a:blip r:embed="rId53"/>
+                          <a:blip r:embed="rId72"/>
                           <a:stretch>
                             <a:fillRect/>
                           </a:stretch>
@@ -33378,7 +33378,7 @@
                         <pic:spPr>
                           <a:xfrm>
                             <a:off x="0" y="0"/>
-                            <a:ext cx="1874519" cy="1319682"/>
+                            <a:ext cx="1874519" cy="1243229"/>
                           </a:xfrm>
                           <a:prstGeom prst="rect"/>
                         </pic:spPr>
@@ -36331,7 +36331,7 @@
               <w:drawing>
                 <wp:inline xmlns:a="http://schemas.openxmlformats.org/drawingml/2006/main" xmlns:pic="http://schemas.openxmlformats.org/drawingml/2006/picture">
                   <wp:extent cx="1874519" cy="2225991"/>
-                  <wp:docPr id="1987301643" name="Picture 1987301643"/>
+                  <wp:docPr id="1987301662" name="Picture 1987301662"/>
                   <wp:cNvGraphicFramePr>
                     <a:graphicFrameLocks noChangeAspect="1"/>
                   </wp:cNvGraphicFramePr>
@@ -36339,7 +36339,7 @@
                     <a:graphicData uri="http://schemas.openxmlformats.org/drawingml/2006/picture">
                       <pic:pic>
                         <pic:nvPicPr>
-                          <pic:cNvPr id="0" name="1.png"/>
+                          <pic:cNvPr id="0" name="image.png"/>
                           <pic:cNvPicPr/>
                         </pic:nvPicPr>
                         <pic:blipFill>
@@ -36373,7 +36373,7 @@
               <w:drawing>
                 <wp:inline xmlns:a="http://schemas.openxmlformats.org/drawingml/2006/main" xmlns:pic="http://schemas.openxmlformats.org/drawingml/2006/picture">
                   <wp:extent cx="1874519" cy="2225991"/>
-                  <wp:docPr id="1987301644" name="Picture 1987301644"/>
+                  <wp:docPr id="1987301663" name="Picture 1987301663"/>
                   <wp:cNvGraphicFramePr>
                     <a:graphicFrameLocks noChangeAspect="1"/>
                   </wp:cNvGraphicFramePr>
@@ -36381,7 +36381,7 @@
                     <a:graphicData uri="http://schemas.openxmlformats.org/drawingml/2006/picture">
                       <pic:pic>
                         <pic:nvPicPr>
-                          <pic:cNvPr id="0" name="2.png"/>
+                          <pic:cNvPr id="0" name="image.png"/>
                           <pic:cNvPicPr/>
                         </pic:nvPicPr>
                         <pic:blipFill>
@@ -36415,7 +36415,7 @@
               <w:drawing>
                 <wp:inline xmlns:a="http://schemas.openxmlformats.org/drawingml/2006/main" xmlns:pic="http://schemas.openxmlformats.org/drawingml/2006/picture">
                   <wp:extent cx="1874519" cy="2225991"/>
-                  <wp:docPr id="1987301645" name="Picture 1987301645"/>
+                  <wp:docPr id="1987301664" name="Picture 1987301664"/>
                   <wp:cNvGraphicFramePr>
                     <a:graphicFrameLocks noChangeAspect="1"/>
                   </wp:cNvGraphicFramePr>
@@ -36423,7 +36423,7 @@
                     <a:graphicData uri="http://schemas.openxmlformats.org/drawingml/2006/picture">
                       <pic:pic>
                         <pic:nvPicPr>
-                          <pic:cNvPr id="0" name="3.png"/>
+                          <pic:cNvPr id="0" name="image.png"/>
                           <pic:cNvPicPr/>
                         </pic:nvPicPr>
                         <pic:blipFill>
@@ -36595,7 +36595,7 @@
               <w:drawing>
                 <wp:inline xmlns:a="http://schemas.openxmlformats.org/drawingml/2006/main" xmlns:pic="http://schemas.openxmlformats.org/drawingml/2006/picture">
                   <wp:extent cx="1874519" cy="2225991"/>
-                  <wp:docPr id="1987301646" name="Picture 1987301646"/>
+                  <wp:docPr id="1987301665" name="Picture 1987301665"/>
                   <wp:cNvGraphicFramePr>
                     <a:graphicFrameLocks noChangeAspect="1"/>
                   </wp:cNvGraphicFramePr>
@@ -36603,7 +36603,7 @@
                     <a:graphicData uri="http://schemas.openxmlformats.org/drawingml/2006/picture">
                       <pic:pic>
                         <pic:nvPicPr>
-                          <pic:cNvPr id="0" name="1.png"/>
+                          <pic:cNvPr id="0" name="image.png"/>
                           <pic:cNvPicPr/>
                         </pic:nvPicPr>
                         <pic:blipFill>
@@ -36637,7 +36637,7 @@
               <w:drawing>
                 <wp:inline xmlns:a="http://schemas.openxmlformats.org/drawingml/2006/main" xmlns:pic="http://schemas.openxmlformats.org/drawingml/2006/picture">
                   <wp:extent cx="1874519" cy="2225991"/>
-                  <wp:docPr id="1987301647" name="Picture 1987301647"/>
+                  <wp:docPr id="1987301666" name="Picture 1987301666"/>
                   <wp:cNvGraphicFramePr>
                     <a:graphicFrameLocks noChangeAspect="1"/>
                   </wp:cNvGraphicFramePr>
@@ -36645,7 +36645,7 @@
                     <a:graphicData uri="http://schemas.openxmlformats.org/drawingml/2006/picture">
                       <pic:pic>
                         <pic:nvPicPr>
-                          <pic:cNvPr id="0" name="2.png"/>
+                          <pic:cNvPr id="0" name="image.png"/>
                           <pic:cNvPicPr/>
                         </pic:nvPicPr>
                         <pic:blipFill>
@@ -36679,7 +36679,7 @@
               <w:drawing>
                 <wp:inline xmlns:a="http://schemas.openxmlformats.org/drawingml/2006/main" xmlns:pic="http://schemas.openxmlformats.org/drawingml/2006/picture">
                   <wp:extent cx="1874519" cy="2225991"/>
-                  <wp:docPr id="1987301648" name="Picture 1987301648"/>
+                  <wp:docPr id="1987301667" name="Picture 1987301667"/>
                   <wp:cNvGraphicFramePr>
                     <a:graphicFrameLocks noChangeAspect="1"/>
                   </wp:cNvGraphicFramePr>
@@ -36687,7 +36687,7 @@
                     <a:graphicData uri="http://schemas.openxmlformats.org/drawingml/2006/picture">
                       <pic:pic>
                         <pic:nvPicPr>
-                          <pic:cNvPr id="0" name="3.png"/>
+                          <pic:cNvPr id="0" name="image.png"/>
                           <pic:cNvPicPr/>
                         </pic:nvPicPr>
                         <pic:blipFill>
@@ -36906,7 +36906,7 @@
               <w:drawing>
                 <wp:inline xmlns:a="http://schemas.openxmlformats.org/drawingml/2006/main" xmlns:pic="http://schemas.openxmlformats.org/drawingml/2006/picture">
                   <wp:extent cx="1874519" cy="2225991"/>
-                  <wp:docPr id="1987301649" name="Picture 1987301649"/>
+                  <wp:docPr id="1987301668" name="Picture 1987301668"/>
                   <wp:cNvGraphicFramePr>
                     <a:graphicFrameLocks noChangeAspect="1"/>
                   </wp:cNvGraphicFramePr>
@@ -36914,7 +36914,7 @@
                     <a:graphicData uri="http://schemas.openxmlformats.org/drawingml/2006/picture">
                       <pic:pic>
                         <pic:nvPicPr>
-                          <pic:cNvPr id="0" name="4.png"/>
+                          <pic:cNvPr id="0" name="image.png"/>
                           <pic:cNvPicPr/>
                         </pic:nvPicPr>
                         <pic:blipFill>
@@ -36948,7 +36948,7 @@
               <w:drawing>
                 <wp:inline xmlns:a="http://schemas.openxmlformats.org/drawingml/2006/main" xmlns:pic="http://schemas.openxmlformats.org/drawingml/2006/picture">
                   <wp:extent cx="1874519" cy="2225991"/>
-                  <wp:docPr id="1987301650" name="Picture 1987301650"/>
+                  <wp:docPr id="1987301669" name="Picture 1987301669"/>
                   <wp:cNvGraphicFramePr>
                     <a:graphicFrameLocks noChangeAspect="1"/>
                   </wp:cNvGraphicFramePr>
@@ -36956,7 +36956,7 @@
                     <a:graphicData uri="http://schemas.openxmlformats.org/drawingml/2006/picture">
                       <pic:pic>
                         <pic:nvPicPr>
-                          <pic:cNvPr id="0" name="5.png"/>
+                          <pic:cNvPr id="0" name="image.png"/>
                           <pic:cNvPicPr/>
                         </pic:nvPicPr>
                         <pic:blipFill>
@@ -36990,7 +36990,7 @@
               <w:drawing>
                 <wp:inline xmlns:a="http://schemas.openxmlformats.org/drawingml/2006/main" xmlns:pic="http://schemas.openxmlformats.org/drawingml/2006/picture">
                   <wp:extent cx="1874519" cy="2225991"/>
-                  <wp:docPr id="1987301651" name="Picture 1987301651"/>
+                  <wp:docPr id="1987301670" name="Picture 1987301670"/>
                   <wp:cNvGraphicFramePr>
                     <a:graphicFrameLocks noChangeAspect="1"/>
                   </wp:cNvGraphicFramePr>
@@ -36998,7 +36998,7 @@
                     <a:graphicData uri="http://schemas.openxmlformats.org/drawingml/2006/picture">
                       <pic:pic>
                         <pic:nvPicPr>
-                          <pic:cNvPr id="0" name="6.png"/>
+                          <pic:cNvPr id="0" name="image.png"/>
                           <pic:cNvPicPr/>
                         </pic:nvPicPr>
                         <pic:blipFill>
@@ -37735,7 +37735,7 @@
               <w:drawing>
                 <wp:inline xmlns:a="http://schemas.openxmlformats.org/drawingml/2006/main" xmlns:pic="http://schemas.openxmlformats.org/drawingml/2006/picture">
                   <wp:extent cx="1874519" cy="2225991"/>
-                  <wp:docPr id="1987301652" name="Picture 1987301652"/>
+                  <wp:docPr id="1987301671" name="Picture 1987301671"/>
                   <wp:cNvGraphicFramePr>
                     <a:graphicFrameLocks noChangeAspect="1"/>
                   </wp:cNvGraphicFramePr>
@@ -37743,7 +37743,7 @@
                     <a:graphicData uri="http://schemas.openxmlformats.org/drawingml/2006/picture">
                       <pic:pic>
                         <pic:nvPicPr>
-                          <pic:cNvPr id="0" name="4.png"/>
+                          <pic:cNvPr id="0" name="image.png"/>
                           <pic:cNvPicPr/>
                         </pic:nvPicPr>
                         <pic:blipFill>
@@ -37777,7 +37777,7 @@
               <w:drawing>
                 <wp:inline xmlns:a="http://schemas.openxmlformats.org/drawingml/2006/main" xmlns:pic="http://schemas.openxmlformats.org/drawingml/2006/picture">
                   <wp:extent cx="1874519" cy="2225991"/>
-                  <wp:docPr id="1987301653" name="Picture 1987301653"/>
+                  <wp:docPr id="1987301672" name="Picture 1987301672"/>
                   <wp:cNvGraphicFramePr>
                     <a:graphicFrameLocks noChangeAspect="1"/>
                   </wp:cNvGraphicFramePr>
@@ -37785,7 +37785,7 @@
                     <a:graphicData uri="http://schemas.openxmlformats.org/drawingml/2006/picture">
                       <pic:pic>
                         <pic:nvPicPr>
-                          <pic:cNvPr id="0" name="5.png"/>
+                          <pic:cNvPr id="0" name="image.png"/>
                           <pic:cNvPicPr/>
                         </pic:nvPicPr>
                         <pic:blipFill>
@@ -37819,7 +37819,7 @@
               <w:drawing>
                 <wp:inline xmlns:a="http://schemas.openxmlformats.org/drawingml/2006/main" xmlns:pic="http://schemas.openxmlformats.org/drawingml/2006/picture">
                   <wp:extent cx="1874519" cy="2225991"/>
-                  <wp:docPr id="1987301654" name="Picture 1987301654"/>
+                  <wp:docPr id="1987301673" name="Picture 1987301673"/>
                   <wp:cNvGraphicFramePr>
                     <a:graphicFrameLocks noChangeAspect="1"/>
                   </wp:cNvGraphicFramePr>
@@ -37827,7 +37827,7 @@
                     <a:graphicData uri="http://schemas.openxmlformats.org/drawingml/2006/picture">
                       <pic:pic>
                         <pic:nvPicPr>
-                          <pic:cNvPr id="0" name="6.png"/>
+                          <pic:cNvPr id="0" name="image.png"/>
                           <pic:cNvPicPr/>
                         </pic:nvPicPr>
                         <pic:blipFill>
@@ -39411,8 +39411,8 @@
             <w:r>
               <w:drawing>
                 <wp:inline xmlns:a="http://schemas.openxmlformats.org/drawingml/2006/main" xmlns:pic="http://schemas.openxmlformats.org/drawingml/2006/picture">
-                  <wp:extent cx="1463040" cy="814132"/>
-                  <wp:docPr id="1987301655" name="Picture 1987301655"/>
+                  <wp:extent cx="1463040" cy="874160"/>
+                  <wp:docPr id="1987301674" name="Picture 1987301674"/>
                   <wp:cNvGraphicFramePr>
                     <a:graphicFrameLocks noChangeAspect="1"/>
                   </wp:cNvGraphicFramePr>
@@ -39420,11 +39420,11 @@
                     <a:graphicData uri="http://schemas.openxmlformats.org/drawingml/2006/picture">
                       <pic:pic>
                         <pic:nvPicPr>
-                          <pic:cNvPr id="0" name="17a.png"/>
+                          <pic:cNvPr id="0" name="17a.PNG"/>
                           <pic:cNvPicPr/>
                         </pic:nvPicPr>
                         <pic:blipFill>
-                          <a:blip r:embed="rId66"/>
+                          <a:blip r:embed="rId73"/>
                           <a:stretch>
                             <a:fillRect/>
                           </a:stretch>
@@ -39432,7 +39432,7 @@
                         <pic:spPr>
                           <a:xfrm>
                             <a:off x="0" y="0"/>
-                            <a:ext cx="1463040" cy="814132"/>
+                            <a:ext cx="1463040" cy="874160"/>
                           </a:xfrm>
                           <a:prstGeom prst="rect"/>
                         </pic:spPr>
@@ -39453,8 +39453,8 @@
             <w:r>
               <w:drawing>
                 <wp:inline xmlns:a="http://schemas.openxmlformats.org/drawingml/2006/main" xmlns:pic="http://schemas.openxmlformats.org/drawingml/2006/picture">
-                  <wp:extent cx="1463040" cy="1115937"/>
-                  <wp:docPr id="1987301656" name="Picture 1987301656"/>
+                  <wp:extent cx="1463040" cy="919913"/>
+                  <wp:docPr id="1987301675" name="Picture 1987301675"/>
                   <wp:cNvGraphicFramePr>
                     <a:graphicFrameLocks noChangeAspect="1"/>
                   </wp:cNvGraphicFramePr>
@@ -39462,11 +39462,11 @@
                     <a:graphicData uri="http://schemas.openxmlformats.org/drawingml/2006/picture">
                       <pic:pic>
                         <pic:nvPicPr>
-                          <pic:cNvPr id="0" name="17b.png"/>
+                          <pic:cNvPr id="0" name="17b.PNG"/>
                           <pic:cNvPicPr/>
                         </pic:nvPicPr>
                         <pic:blipFill>
-                          <a:blip r:embed="rId67"/>
+                          <a:blip r:embed="rId74"/>
                           <a:stretch>
                             <a:fillRect/>
                           </a:stretch>
@@ -39474,7 +39474,7 @@
                         <pic:spPr>
                           <a:xfrm>
                             <a:off x="0" y="0"/>
-                            <a:ext cx="1463040" cy="1115937"/>
+                            <a:ext cx="1463040" cy="919913"/>
                           </a:xfrm>
                           <a:prstGeom prst="rect"/>
                         </pic:spPr>
@@ -39540,8 +39540,8 @@
             <w:r>
               <w:drawing>
                 <wp:inline xmlns:a="http://schemas.openxmlformats.org/drawingml/2006/main" xmlns:pic="http://schemas.openxmlformats.org/drawingml/2006/picture">
-                  <wp:extent cx="1463040" cy="765587"/>
-                  <wp:docPr id="1987301657" name="Picture 1987301657"/>
+                  <wp:extent cx="1463040" cy="780015"/>
+                  <wp:docPr id="1987301676" name="Picture 1987301676"/>
                   <wp:cNvGraphicFramePr>
                     <a:graphicFrameLocks noChangeAspect="1"/>
                   </wp:cNvGraphicFramePr>
@@ -39549,11 +39549,11 @@
                     <a:graphicData uri="http://schemas.openxmlformats.org/drawingml/2006/picture">
                       <pic:pic>
                         <pic:nvPicPr>
-                          <pic:cNvPr id="0" name="17a.png"/>
+                          <pic:cNvPr id="0" name="17a.PNG"/>
                           <pic:cNvPicPr/>
                         </pic:nvPicPr>
                         <pic:blipFill>
-                          <a:blip r:embed="rId68"/>
+                          <a:blip r:embed="rId75"/>
                           <a:stretch>
                             <a:fillRect/>
                           </a:stretch>
@@ -39561,7 +39561,7 @@
                         <pic:spPr>
                           <a:xfrm>
                             <a:off x="0" y="0"/>
-                            <a:ext cx="1463040" cy="765587"/>
+                            <a:ext cx="1463040" cy="780015"/>
                           </a:xfrm>
                           <a:prstGeom prst="rect"/>
                         </pic:spPr>
@@ -39582,8 +39582,8 @@
             <w:r>
               <w:drawing>
                 <wp:inline xmlns:a="http://schemas.openxmlformats.org/drawingml/2006/main" xmlns:pic="http://schemas.openxmlformats.org/drawingml/2006/picture">
-                  <wp:extent cx="1463040" cy="831607"/>
-                  <wp:docPr id="1987301658" name="Picture 1987301658"/>
+                  <wp:extent cx="1463040" cy="872610"/>
+                  <wp:docPr id="1987301677" name="Picture 1987301677"/>
                   <wp:cNvGraphicFramePr>
                     <a:graphicFrameLocks noChangeAspect="1"/>
                   </wp:cNvGraphicFramePr>
@@ -39591,11 +39591,11 @@
                     <a:graphicData uri="http://schemas.openxmlformats.org/drawingml/2006/picture">
                       <pic:pic>
                         <pic:nvPicPr>
-                          <pic:cNvPr id="0" name="17b.png"/>
+                          <pic:cNvPr id="0" name="17b.PNG"/>
                           <pic:cNvPicPr/>
                         </pic:nvPicPr>
                         <pic:blipFill>
-                          <a:blip r:embed="rId69"/>
+                          <a:blip r:embed="rId76"/>
                           <a:stretch>
                             <a:fillRect/>
                           </a:stretch>
@@ -39603,7 +39603,7 @@
                         <pic:spPr>
                           <a:xfrm>
                             <a:off x="0" y="0"/>
-                            <a:ext cx="1463040" cy="831607"/>
+                            <a:ext cx="1463040" cy="872610"/>
                           </a:xfrm>
                           <a:prstGeom prst="rect"/>
                         </pic:spPr>
@@ -39727,6 +39727,422 @@
         </w:sectPr>
       </w:pPr>
     </w:p>
+    <w:p>
+      <w:pPr>
+        <w:pStyle w:val="ListParagraph"/>
+      </w:pPr>
+      <w:r>
+        <w:rPr>
+          <w:b w:val="0"/>
+          <w:highlight w:val="yellow"/>
+        </w:rPr>
+        <w:t>Ponovljene spoljašnje podele (KOREKCIJA: dopuna profesorovog komentara 2)</w:t>
+      </w:r>
+    </w:p>
+    <w:p/>
+    <w:p/>
+    <w:p>
+      <w:r>
+        <w:rPr>
+          <w:b w:val="0"/>
+          <w:highlight w:val="yellow"/>
+        </w:rPr>
+        <w:t>Sve rezultate u prethodnim odeljcima (Tabele 2–9) dobijene su na jednoj, fiksnoj podeli na trening i test skup (seme 42, 29 test studenata) — upravo ono na šta profesor upozorava u komentaru 2. Da bi se proverilo koliko su ti nalazi osetljivi na izbor te konkretne podele, ceo tok — nezavisna stratifikovana train/test podela, treniranje petomodelnog ansambla sa već pronađenim optimizovanim hiperparametrima (Tabela 1) i evaluacija — ponovljen je preko 15 nezavisnih spoljašnjih semena (100–114), različitih od semena 42. Radi ograničavanja računske složenosti, optimizacija rojem čestica nije ponovo pokretana za svaku od 15 podela (to bi bio pun nested cross-validation pristup); umesto toga, već pronađeni hiperparametri za svaku strategiju unakrsne validacije (Tabela 1) primenjeni su nepromenjeni na svih 15 novih podela, dok je za svaku podelu iznova treniran kompletan petomodelni ansambl sa nezavisno inicijalizovanim semenima (0–4) i sopstvenom internom validacionom podelom za rano zaustavljanje. Podrazumevani (bazni) model je takođe iznova treniran i evaluiran za svaku od 15 podela, bez podešavanja hiperparametara, radi poštene osnove za poređenje. Balansirane težine klasa i kodiranje ciljne promenljive računati su jednom, nad celim skupom podataka, i korišćeni nepromenjeni za svih 15 podela — pojednostavljenje čiji je uticaj mali, budući da se raspodela klasa malo menja od podele do podele.</w:t>
+      </w:r>
+    </w:p>
+    <w:p/>
+    <w:p>
+      <w:r>
+        <w:rPr>
+          <w:b w:val="0"/>
+          <w:highlight w:val="yellow"/>
+        </w:rPr>
+        <w:t>Tabela 10. Srednja vrednost ± standardna devijacija preko 15 nezavisnih spoljašnjih podela (semena 100–114)</w:t>
+      </w:r>
+    </w:p>
+    <w:p/>
+    <w:tbl>
+      <w:tblPr>
+        <w:tblStyle w:val="TableGrid"/>
+        <w:tblW w:type="auto" w:w="0"/>
+        <w:tblLook w:firstColumn="1" w:firstRow="1" w:lastColumn="0" w:lastRow="0" w:noHBand="0" w:noVBand="1" w:val="04A0"/>
+      </w:tblPr>
+      <w:tblGrid>
+        <w:gridCol w:w="2160"/>
+        <w:gridCol w:w="2160"/>
+        <w:gridCol w:w="2160"/>
+        <w:gridCol w:w="2160"/>
+      </w:tblGrid>
+      <w:tr>
+        <w:tc>
+          <w:tcPr>
+            <w:tcW w:type="dxa" w:w="2160"/>
+          </w:tcPr>
+          <w:p>
+            <w:r/>
+            <w:r>
+              <w:rPr>
+                <w:highlight w:val="yellow"/>
+              </w:rPr>
+              <w:t>Metrika</w:t>
+            </w:r>
+          </w:p>
+        </w:tc>
+        <w:tc>
+          <w:tcPr>
+            <w:tcW w:type="dxa" w:w="2160"/>
+          </w:tcPr>
+          <w:p>
+            <w:r/>
+            <w:r>
+              <w:rPr>
+                <w:highlight w:val="yellow"/>
+              </w:rPr>
+              <w:t>Bazni model</w:t>
+            </w:r>
+          </w:p>
+        </w:tc>
+        <w:tc>
+          <w:tcPr>
+            <w:tcW w:type="dxa" w:w="2160"/>
+          </w:tcPr>
+          <w:p>
+            <w:r/>
+            <w:r>
+              <w:rPr>
+                <w:highlight w:val="yellow"/>
+              </w:rPr>
+              <w:t>Optimizovan (stratifikovana)</w:t>
+            </w:r>
+          </w:p>
+        </w:tc>
+        <w:tc>
+          <w:tcPr>
+            <w:tcW w:type="dxa" w:w="2160"/>
+          </w:tcPr>
+          <w:p>
+            <w:r/>
+            <w:r>
+              <w:rPr>
+                <w:highlight w:val="yellow"/>
+              </w:rPr>
+              <w:t>Optimizovan (ponovljena)</w:t>
+            </w:r>
+          </w:p>
+        </w:tc>
+      </w:tr>
+      <w:tr>
+        <w:tc>
+          <w:tcPr>
+            <w:tcW w:type="dxa" w:w="2160"/>
+          </w:tcPr>
+          <w:p>
+            <w:r/>
+            <w:r>
+              <w:rPr>
+                <w:highlight w:val="yellow"/>
+              </w:rPr>
+              <w:t>Tačnost</w:t>
+            </w:r>
+          </w:p>
+        </w:tc>
+        <w:tc>
+          <w:tcPr>
+            <w:tcW w:type="dxa" w:w="2160"/>
+          </w:tcPr>
+          <w:p>
+            <w:r/>
+            <w:r>
+              <w:rPr>
+                <w:highlight w:val="yellow"/>
+              </w:rPr>
+              <w:t>0,2690 ± 0,0644</w:t>
+            </w:r>
+          </w:p>
+        </w:tc>
+        <w:tc>
+          <w:tcPr>
+            <w:tcW w:type="dxa" w:w="2160"/>
+          </w:tcPr>
+          <w:p>
+            <w:r/>
+            <w:r>
+              <w:rPr>
+                <w:highlight w:val="yellow"/>
+              </w:rPr>
+              <w:t>0,2161 ± 0,0445</w:t>
+            </w:r>
+          </w:p>
+        </w:tc>
+        <w:tc>
+          <w:tcPr>
+            <w:tcW w:type="dxa" w:w="2160"/>
+          </w:tcPr>
+          <w:p>
+            <w:r/>
+            <w:r>
+              <w:rPr>
+                <w:highlight w:val="yellow"/>
+              </w:rPr>
+              <w:t>0,2115 ± 0,0722</w:t>
+            </w:r>
+          </w:p>
+        </w:tc>
+      </w:tr>
+      <w:tr>
+        <w:tc>
+          <w:tcPr>
+            <w:tcW w:type="dxa" w:w="2160"/>
+          </w:tcPr>
+          <w:p>
+            <w:r/>
+            <w:r>
+              <w:rPr>
+                <w:highlight w:val="yellow"/>
+              </w:rPr>
+              <w:t>Log-loss</w:t>
+            </w:r>
+          </w:p>
+        </w:tc>
+        <w:tc>
+          <w:tcPr>
+            <w:tcW w:type="dxa" w:w="2160"/>
+          </w:tcPr>
+          <w:p>
+            <w:r/>
+            <w:r>
+              <w:rPr>
+                <w:highlight w:val="yellow"/>
+              </w:rPr>
+              <w:t>2,0484 ± 0,1189</w:t>
+            </w:r>
+          </w:p>
+        </w:tc>
+        <w:tc>
+          <w:tcPr>
+            <w:tcW w:type="dxa" w:w="2160"/>
+          </w:tcPr>
+          <w:p>
+            <w:r/>
+            <w:r>
+              <w:rPr>
+                <w:highlight w:val="yellow"/>
+              </w:rPr>
+              <w:t>2,0301 ± 0,0191</w:t>
+            </w:r>
+          </w:p>
+        </w:tc>
+        <w:tc>
+          <w:tcPr>
+            <w:tcW w:type="dxa" w:w="2160"/>
+          </w:tcPr>
+          <w:p>
+            <w:r/>
+            <w:r>
+              <w:rPr>
+                <w:highlight w:val="yellow"/>
+              </w:rPr>
+              <w:t>2,0415 ± 0,0138</w:t>
+            </w:r>
+          </w:p>
+        </w:tc>
+      </w:tr>
+      <w:tr>
+        <w:tc>
+          <w:tcPr>
+            <w:tcW w:type="dxa" w:w="2160"/>
+          </w:tcPr>
+          <w:p>
+            <w:r/>
+            <w:r>
+              <w:rPr>
+                <w:highlight w:val="yellow"/>
+              </w:rPr>
+              <w:t>Makro-F1</w:t>
+            </w:r>
+          </w:p>
+        </w:tc>
+        <w:tc>
+          <w:tcPr>
+            <w:tcW w:type="dxa" w:w="2160"/>
+          </w:tcPr>
+          <w:p>
+            <w:r/>
+            <w:r>
+              <w:rPr>
+                <w:highlight w:val="yellow"/>
+              </w:rPr>
+              <w:t>0,1574 ± 0,0627</w:t>
+            </w:r>
+          </w:p>
+        </w:tc>
+        <w:tc>
+          <w:tcPr>
+            <w:tcW w:type="dxa" w:w="2160"/>
+          </w:tcPr>
+          <w:p>
+            <w:r/>
+            <w:r>
+              <w:rPr>
+                <w:highlight w:val="yellow"/>
+              </w:rPr>
+              <w:t>0,1447 ± 0,0518</w:t>
+            </w:r>
+          </w:p>
+        </w:tc>
+        <w:tc>
+          <w:tcPr>
+            <w:tcW w:type="dxa" w:w="2160"/>
+          </w:tcPr>
+          <w:p>
+            <w:r/>
+            <w:r>
+              <w:rPr>
+                <w:highlight w:val="yellow"/>
+              </w:rPr>
+              <w:t>0,1341 ± 0,0610</w:t>
+            </w:r>
+          </w:p>
+        </w:tc>
+      </w:tr>
+      <w:tr>
+        <w:tc>
+          <w:tcPr>
+            <w:tcW w:type="dxa" w:w="2160"/>
+          </w:tcPr>
+          <w:p>
+            <w:r/>
+            <w:r>
+              <w:rPr>
+                <w:highlight w:val="yellow"/>
+              </w:rPr>
+              <w:t>Makro-preciznost</w:t>
+            </w:r>
+          </w:p>
+        </w:tc>
+        <w:tc>
+          <w:tcPr>
+            <w:tcW w:type="dxa" w:w="2160"/>
+          </w:tcPr>
+          <w:p>
+            <w:r/>
+            <w:r>
+              <w:rPr>
+                <w:highlight w:val="yellow"/>
+              </w:rPr>
+              <w:t>0,1723 ± 0,0815</w:t>
+            </w:r>
+          </w:p>
+        </w:tc>
+        <w:tc>
+          <w:tcPr>
+            <w:tcW w:type="dxa" w:w="2160"/>
+          </w:tcPr>
+          <w:p>
+            <w:r/>
+            <w:r>
+              <w:rPr>
+                <w:highlight w:val="yellow"/>
+              </w:rPr>
+              <w:t>0,1488 ± 0,0694</w:t>
+            </w:r>
+          </w:p>
+        </w:tc>
+        <w:tc>
+          <w:tcPr>
+            <w:tcW w:type="dxa" w:w="2160"/>
+          </w:tcPr>
+          <w:p>
+            <w:r/>
+            <w:r>
+              <w:rPr>
+                <w:highlight w:val="yellow"/>
+              </w:rPr>
+              <w:t>0,1254 ± 0,0655</w:t>
+            </w:r>
+          </w:p>
+        </w:tc>
+      </w:tr>
+      <w:tr>
+        <w:tc>
+          <w:tcPr>
+            <w:tcW w:type="dxa" w:w="2160"/>
+          </w:tcPr>
+          <w:p>
+            <w:r/>
+            <w:r>
+              <w:rPr>
+                <w:highlight w:val="yellow"/>
+              </w:rPr>
+              <w:t>Makro-odziv</w:t>
+            </w:r>
+          </w:p>
+        </w:tc>
+        <w:tc>
+          <w:tcPr>
+            <w:tcW w:type="dxa" w:w="2160"/>
+          </w:tcPr>
+          <w:p>
+            <w:r/>
+            <w:r>
+              <w:rPr>
+                <w:highlight w:val="yellow"/>
+              </w:rPr>
+              <w:t>0,1914 ± 0,0613</w:t>
+            </w:r>
+          </w:p>
+        </w:tc>
+        <w:tc>
+          <w:tcPr>
+            <w:tcW w:type="dxa" w:w="2160"/>
+          </w:tcPr>
+          <w:p>
+            <w:r/>
+            <w:r>
+              <w:rPr>
+                <w:highlight w:val="yellow"/>
+              </w:rPr>
+              <w:t>0,1888 ± 0,0523</w:t>
+            </w:r>
+          </w:p>
+        </w:tc>
+        <w:tc>
+          <w:tcPr>
+            <w:tcW w:type="dxa" w:w="2160"/>
+          </w:tcPr>
+          <w:p>
+            <w:r/>
+            <w:r>
+              <w:rPr>
+                <w:highlight w:val="yellow"/>
+              </w:rPr>
+              <w:t>0,1743 ± 0,0715</w:t>
+            </w:r>
+          </w:p>
+        </w:tc>
+      </w:tr>
+    </w:tbl>
+    <w:p/>
+    <w:p>
+      <w:r>
+        <w:rPr>
+          <w:b w:val="0"/>
+          <w:highlight w:val="yellow"/>
+        </w:rPr>
+        <w:t>Rezultati u Tabeli 10 pokazuju bitno drugačiju sliku od one dobijene na jedinoj podeli sa semenom 42 (Tabele 2–4, 9). Preko 15 nezavisnih podela, optimizovani model sa standardnom stratifikovanom K-strukom bio je bolji od baznog modela u samo 20,0% podela po tačnosti, u 53,3% po log-loss-u i u 46,7% po sve tri makro metrike — praktično podjednako često lošiji koliko i bolji, umesto dosledno bolji kao na jedinoj podeli sa semenom 42. Prosečna razlika (optimizovan minus bazni) preko 15 podela je za tu varijantu −0,0529 za tačnost, −0,0127 za makro-F1, −0,0235 za makro-preciznost i −0,0027 za makro-odziv (log-loss neznatno bolji, −0,0182). Optimizovani model sa ponovljenom stratifikovanom K-strukom pokazuje sličan, čak nešto lošiji obrazac: bolji od baznog u samo 13,3% podela po tačnosti, 53,3% po log-loss-u i 46,7% po makro metrikama, sa prosečnim razlikama od −0,0575 (tačnost), −0,0233 (makro-F1), −0,0469 (makro-preciznost) i −0,0171 (makro-odziv). Ovo pokazuje da je znatno poboljšanje sve tri makro metrike koje je optimizovani model sa standardnom stratifikovanom K-strukom postigao na jedinoj podeli sa semenom 42 (Tabela 3, odeljak 3.1) sa velikom verovatnoćom bilo artefakt te konkretne, slučajno povoljne podele, a ne pouzdano, generalizabilno svojstvo optimizovanog pristupa. Ovo je direktna, kvantitativna potvrda profesorovog drugog komentara: evaluacija na jednom test skupu od 29 studenata zaista nije bila dovoljna za pouzdane zaključke, a nalazi izneti u odeljku 3.1 treba tumačiti kao svojstvo te konkretne podele, a ne kao pouzdano utvrđenu prednost optimizovanog pristupa.</w:t>
+      </w:r>
+    </w:p>
+    <w:p/>
+    <w:p>
+      <w:r>
+        <w:rPr>
+          <w:b w:val="0"/>
+          <w:highlight w:val="yellow"/>
+        </w:rPr>
+        <w:t>Poređenje dve strategije unakrsne validacije preko istih 15 spoljašnjih podela daje pouzdaniji odgovor na treću istraživačku hipotezu nego jedina podela sa semenom 42. Hiperparametri pronađeni standardnom stratifikovanom K-strukom (Tabela 1) generalizuju bolje od onih pronađenih ponovljenom stratifikovanom K-strukom po svih pet posmatranih metrika, prosečno preko 15 podela: tačnost viša za 0,0046, log-loss niži za 0,0114, makro-F1 viši za 0,0106, makro-preciznost viša za 0,0234, a makro-odziv viši za 0,0145. Ovo je isti smer kao na jedinoj podeli sa semenom 42 (gde je standardna varijanta bila bolja po četiri od pet metrika, Tabela 9), ali sada oslonjen na znatno šire dokaze. Važna metodološka napomena ograničava domet ovog nalaza: poređenje testira koliko dobro generalizuju KONKRETNE vrednosti hiperparametara koje je PSO pronašao jednom, na originalnoj podeli sa semenom 42 (posebno za svaku strategiju) — optimizacija rojem čestica nije ponovo pokretana za svaku od 15 spoljašnjih podela, što bi bio pun nested cross-validation pristup i ostaje budući korak. Nalaz, stoga, pokazuje da su konkretne hiperparametarske vrednosti pronađene standardnom K-strukom robusniji izbor za ovaj skup podataka, a ne nužno da standardna K-struka kao metoda PSO optimizacije uvek pronalazi bolje hiperparametre od ponovljene.</w:t>
+      </w:r>
+    </w:p>
+    <w:p/>
     <w:p>
       <w:pPr>
         <w:widowControl w:val="0"/>
@@ -39809,7 +40225,7 @@
         <w:rPr>
           <w:highlight w:val="yellow"/>
         </w:rPr>
-        <w:t>Nakon ispravke curenja podataka (kom. 2), uklanjanja obeležja COURSE ID i, u ovoj verziji, ponovnog pokretanja optimizacije rojem čestica direktno nad konačnim skupom od 30 obeležja, prva istraživačka hipoteza je potvrđena znatno jasnije za model optimizovan standardnom stratifikovanom K-strukom unakrsnom validacijom nego u bilo kojoj prethodnoj verziji ovog rada: sve tri makro metrike su bolje od baznog modela (makro-F1 +0,0820, makro-preciznost +0,1013, makro-odziv +0,0581), tačnost je nepromenjena, a jedino je log-loss blago lošiji (+0,0404). Uparena bootstrap analiza ide u prilog istom zaključku: ovaj model je bio bolji od baznog po makro-preciznosti u 89,8% resemplovanja, po makro-F1 u 88,2% i po makro-odzivu u 77,0%. Za model optimizovan ponovljenom stratifikovanom K-strukom unakrsnom validacijom slika je znatno skromnija: samo makro-preciznost (+0,1091) i makro-F1 (+0,0170) su bolji od baznog modela, dok su tačnost (−0,0690), log-loss (+0,0504) i makro-odziv (−0,0285) lošiji, a uparena bootstrap analiza favorizuje optimizovani model u samo 8,1% (tačnost) i 18,4% (makro-odziv) resemplovanja — u velikoj većini resemplovanja lošiji je od baznog po te dve metrike. Reč „značajno” je i dalje namerno izbegnuta jer nijedna od navedenih razlika nije potvrđena formalnim statističkim testom: bootstrap 95% intervali pouzdanosti (Tabela 5) se za sve metrike i dalje u velikoj meri preklapaju između baznog i optimizovanih modela, a interval razlike u uparenoj analizi uvek obuhvata nulu. Ipak, doslednost i veličina udela resemplovanja u korist standardne varijante (3 od 5 metrika preko 75%) predstavljaju najubedljiviji, iako i dalje formalno nepotvrđen, dokaz u prilog prvoj hipotezi dobijen u ovom istraživanju do sada — i to samo za standardnu, ne i za ponovljenu varijantu unakrsne validacije. Ablaciona analiza (Tabela 6) pokazuje da PSO hiperparametri primenjeni na pojedinačan model (bez ansambla) dosledno štete performansama kod oba pokretanja, i da čitava korist standardne varijante dolazi od usrednjavanja preko ansambla od pet modela. Prva istraživačka hipoteza se, prema tome, može smatrati delimično do umereno potvrđenom za model optimizovan standardnom stratifikovanom K-strukom unakrsnom validacijom, dok za ponovljenu varijantu ostaje slabo potvrđena. Kombinovana upotreba ugrađene procene važnosti obeležja algoritma CatBoost i SHAP objašnjenja, agregiranih preko svih pet modela ansambla (kom. 4), pokazala je delimično slaganje između dve mere (8 od 10, odnosno 7 od 10 najuticajnijih obeležja se poklapa) i umereno slaganje između dve strategije unakrsne validacije (6 od 10, nešto više nego u prethodnoj verziji), ali i dalje veliku standardnu devijaciju važnosti preko modela ansambla (do preko 100% srednje vrednosti kod pojedinih obeležja), pa je druga istraživačka hipoteza potvrđena samo delimično — na nivou grube rang-liste, a ne kao pouzdano objašnjenje predikcija.</w:t>
+        <w:t>Nakon ispravke curenja podataka (kom. 2), uklanjanja obeležja COURSE ID i ponovnog pokretanja optimizacije rojem čestica direktno nad konačnim skupom od 30 obeležja, prva istraživačka hipoteza NIJE potvrđena kada se testira na način koji profesor traži u komentaru 2 — preko ponovljenih spoljašnjih podela, a ne na jednoj fiksnoj podeli od 29 studenata. Na jedinoj podeli sa semenom 42, optimizovani model sa standardnom stratifikovanom K-strukom delovao je ubedljivo bolje od baznog modela po sve tri makro metrike (odeljak 3.1, Tabela 3). Međutim, kada je ceo tok ponovljen preko 15 nezavisnih spoljašnjih podela (Tabela 10, odeljak Ponovljene spoljašnje podele), taj isti optimizovani pristup bio je bolji od baznog modela u samo 20,0% podela po tačnosti i u svega 46,7% podela po sve tri makro metrike — praktično podjednako često lošiji koliko i bolji — sa prosečnom razlikom (optimizovan minus bazni) koja je za tačnost, makro-F1, makro-preciznost i makro-odziv blago NEGATIVNA (od −0,0027 do −0,0529). Model optimizovan ponovljenom stratifikovanom K-strukom pokazuje isti, čak nešto izraženiji obrazac (bolji od baznog u samo 13,3% podela po tačnosti). Ovo je važan metodološki obrt u odnosu na sve prethodne verzije ovog rada: naizgled ubedljivo poboljšanje pronađeno na jednoj podeli sa semenom 42 pokazalo se, kada je testirano preko 15 nezavisnih podela, kao artefakt te konkretne, slučajno povoljne podele, a ne kao pouzdano, generalizabilno svojstvo optimizovanog pristupa. Prva istraživačka hipoteza — da balansirane težine klasa, PSO-optimizovani hiperparametri i ansambl modela unapređuju predikciju manjinskih klasa i opštu robusnost modela u odnosu na bazni model — prema tome NIJE potvrđena ni za jednu od dve strategije unakrsne validacije, kada se testira preko ponovljenih spoljašnjih podela umesto na jednoj fiksnoj podeli. Ablaciona analiza (Tabela 6) i uparena bootstrap analiza (Tabela 5) na jedinoj podeli sa semenom 42 pokazuju da je čitava korist standardne varijante na TOJ konkretnoj podeli dolazila od usrednjavanja preko ansambla od pet modela; rezultat preko 15 podela pokazuje da ta korist ne generalizuje pouzdano na druge podele. Kombinovana upotreba ugrađene procene važnosti obeležja algoritma CatBoost i SHAP objašnjenja, agregiranih preko svih pet modela ansambla (kom. 4), pokazala je delimično slaganje između dve mere (8 od 10, odnosno 7 od 10 najuticajnijih obeležja se poklapa) i umereno slaganje između dve strategije unakrsne validacije (6 od 10), ali i dalje veliku standardnu devijaciju važnosti preko modela ansambla (do preko 100% srednje vrednosti kod pojedinih obeležja), pa je druga istraživačka hipoteza potvrđena samo delimično — na nivou grube rang-liste, a ne kao pouzdano objašnjenje predikcija.</w:t>
       </w:r>
       <w:commentRangeEnd w:id="4"/>
       <w:r>
@@ -39857,7 +40273,7 @@
         <w:rPr>
           <w:highlight w:val="yellow"/>
         </w:rPr>
-        <w:t>Treća istraživačka hipoteza — da ponovljena stratifikovana K-struka unakrsna validacija daje stabilniju procenu fitnes funkcije i time dovodi do boljeg optimizovanog modela — u ovoj verziji NIJE potvrđena; naprotiv, standardna stratifikovana K-struka unakrsna validacija dala je bolji model po četiri od pet posmatranih metrika (Tabela 9). Ovo je prva verzija ovog istraživanja u kojoj su hiperparametri obe varijante pronađeni direktno nad istim, konačnim skupom od 30 obeležja, pa poređenje više nije opterećeno prenošenjem hiperparametara iz optimizacije nad drugačijim skupom obeležja, kao u prethodnoj verziji. I dalje važe druga metodološka ograničenja: direktno upareno bootstrap poređenje između dva optimizovana modela nije sprovedeno (sprovedeno je samo poređenje svakog od njih naspram baznog modela), a oba modela dele isti, jedinstveni test skup od 29 studenata, pa se deo prednosti standardne varijante ne može isključiti kao slučajnost vezana za tu konkretnu podelu ili za konkretno nasumično seme PSO optimizacije. Rezultat takođe pokazuje da usrednjavanje fitnes funkcije preko više preklopa (ponovljena varijanta) ne garantuje da će pronađeni hiperparametri bolje generalizovati na test skup — u ovom slučaju, ponovljena varijanta je pronašla znatno dublje, slabije regularizovano stablo, koje se pokazalo lošijim na malom test skupu od 29 studenata. Pouzdaniji zaključak o tome koja strategija unakrsne validacije zaista daje bolji generalizacioni model i dalje bi zahtevao ponavljanje celog eksperimenta preko više nezavisnih nasumičnih semena, što nadilazi obim ovog istraživanja.</w:t>
+        <w:t>Treća istraživačka hipoteza — da ponovljena stratifikovana K-struka unakrsna validacija daje stabilniju procenu fitnes funkcije i time dovodi do boljeg optimizovanog modela — NIJE potvrđena, i to sada na osnovu znatno pouzdanijih dokaza nego u prethodnim verzijama ovog rada. Standardna stratifikovana K-struka unakrsna validacija dala je bolji model po četiri od pet metrika na jedinoj podeli sa semenom 42 (Tabela 9), ali i, što je važnije, po svih pet metrika prosečno preko 15 nezavisnih spoljašnjih podela (Tabela 10, odeljak Ponovljene spoljašnje podele) — dosledan nalaz koji više nije osetljiv na izbor jedne konkretne podele. Bitno metodološko ograničenje i dalje važi: optimizacija rojem čestica nije ponovo pokretana za svaku od 15 spoljašnjih podela (to bi bio pun nested cross-validation pristup), pa nalaz pokazuje da KONKRETNE hiperparametarske vrednosti pronađene standardnom K-strukom (Tabela 1) robusnije generalizuju na nove podatke od onih pronađenih ponovljenom K-strukom, a ne nužno da standardna K-struka kao metoda uvek pronalazi bolje hiperparametre. Pouzdaniji odgovor na to bi zahtevao ponavljanje i same PSO optimizacije preko više nezavisnih spoljašnjih semena (nested cross-validation, RERUN_PSO_PER_OUTER_SEED=True u priloženim skriptama), što je računski mnogo zahtevnije i ostaje sledeći korak.</w:t>
       </w:r>
       <w:commentRangeEnd w:id="9"/>
       <w:r>
@@ -39903,13 +40319,13 @@
       <w:commentRangeStart w:id="12"/>
       <w:r>
         <w:rPr/>
-        <w:t xml:space="preserve">Predloženi pristup — CatBoostClassifier uz PSO optimizaciju hiperparametara i SHAP objašnjivost — daje okvir za rešavanje izazova modela mašinskog učenja poput donošenja pravičnih odluka kada su podaci za treniranje pristrasni, nižeg poverenja i odgovornosti kada donete odluke nisu protumačene i objašnjene, kao i optimizacije hiperparametara. Rezultati ovog istraživanja, međutim, pokazuju da sâmo postojanje takvog okvira ne garantuje da će svaka njegova komponenta (balansirane težine klasa, metaheuristička optimizacija, ansambliranje) zaista poboljšati pravičnost predikcija na svakom skupu podataka — </w:t>
+        <w:t xml:space="preserve">Predloženi pristup — CatBoostClassifier uz PSO optimizaciju hiperparametara i SHAP objašnjivost — daje okvir za rešavanje izazova modela mašinskog učenja poput donošenja pravičnih odluka kada su podaci za treniranje pristrasni, nižeg poverenja i odgovornosti kada donete odluke nisu protumačene i objašnjene, kao i optimizacije hiperparametara. Rezultati ovog istraživanja, međutim, pokazuju da sâmo postojanje takvog okvira ne garantuje da će svaka njegova komponenta (balansirane težine klasa, metaheuristička optimizacija, ansambliranje) zaista poboljšati pravičnost predikcija na svakom skupu podataka — na ovom, malom i izrazito disbalansiranom skupu, ablaciona analiza (Tabela 6) pokazuje da korist zavisi i od komponente i od strategije unakrsne validacije — </w:t>
       </w:r>
       <w:r>
         <w:rPr>
           <w:highlight w:val="yellow"/>
         </w:rPr>
-        <w:t>na ovom, malom i izrazito disbalansiranom skupu, ablaciona analiza (Tabela 6) pokazuje da korist zavisi i od komponente i od strategije unakrsne validacije — PSO hiperparametri primenjeni pojedinačno štete performansama, a korist dolazi od ansambliranja, i to izraženije kod jedne od dve strategije — dok korisna interpretabilnost (kroz SHAP i CatBoost važnost) ostaje dostupna nezavisno od toga.</w:t>
+        <w:t>PSO hiperparametri primenjeni pojedinačno štete performansama, a korist dolazi od ansambliranja, i to izraženije kod jedne od dve strategije — dok korisna interpretabilnost (kroz SHAP i CatBoost važnost) ostaje dostupna nezavisno od toga. Rezultati preko 15 ponovljenih spoljašnjih podela (Tabela 10) pokazuju da čak ni ta korist ansambliranja ne generalizuje pouzdano izvan jedne konkretne podele.</w:t>
       </w:r>
       <w:r>
         <w:rPr/>
@@ -40007,7 +40423,7 @@
         <w:rPr>
           <w:highlight w:val="yellow"/>
         </w:rPr>
-        <w:t>Budući koraci uključuju: direktno upareno bootstrap (ili nested cross-validation) poređenje modela optimizovanog standardnom naspram ponovljene stratifikovane K-struke unakrsne validacije, umesto poređenja svakog naspram baznog modela posebno; ponavljanje celog eksperimenta — uključujući PSO optimizaciju i konačnu podelu na trening i test skup — preko 10 do 20 nezavisnih nasumičnih semena, uz izveštavanje srednje vrednosti i standardne devijacije za svaku metriku (posebno važno s obzirom na to da je redosled standardne i ponovljene varijante u ovoj verziji obrnut u odnosu na prethodnu, što sugeriše osetljivost na nasumično seme); poređenje sa dodatnim standardnim modelima (npr. Random Forest i logistička regresija) kao referentnim tačkama; dublju analizu SHAP objašnjenja koja obuhvata i pravac i intenzitet uticaja obeležja; i, iznad svega, prikupljanje dodatnih uzoraka manjinskih ocena kako bi se smanjila zavisnost zaključaka od svega nekoliko test primera po klasi. Bez ovih koraka, nalazi ovog rada — uključujući to da standardna stratifikovana K-struka unakrsna validacija u ovoj verziji daje bolje rezultate od ponovljene — treba tumačiti kao indikativne za ovaj konkretan skup podataka, ovu konkretnu podelu i ovo konkretno nasumično seme PSO optimizacije, a ne kao opšte, statistički potvrđeno svojstvo dve strategije unakrsne validacije.</w:t>
+        <w:t>Budući koraci uključuju: ponavljanje same optimizacije rojem čestica preko svih 15 (ili više) spoljašnjih podela (pun nested cross-validation, RERUN_PSO_PER_OUTER_SEED=True u priloženim skriptama), umesto ponovnog korišćenja jednom pronađenih hiperparametara za sve podele, kako bi se proverilo da li nalaz da standardna K-struka daje robusniji model (Tabela 10) zavisi i od same PSO pretrage ili samo od primene već pronađenih vrednosti; direktno upareno bootstrap (ili nested cross-validation) poređenje modela optimizovanog standardnom naspram ponovljene stratifikovane K-struke unakrsne validacije na svakoj od ponovljenih podela pojedinačno; poređenje sa dodatnim standardnim modelima (npr. Random Forest i logistička regresija) kao referentnim tačkama, takođe evaluiranim preko ponovljenih spoljašnjih podela; dublju analizu SHAP objašnjenja koja obuhvata i pravac i intenzitet uticaja obeležja; i, iznad svega, prikupljanje dodatnih uzoraka manjinskih ocena kako bi se smanjila zavisnost zaključaka od svega nekoliko test primera po klasi. Nalazi preko 15 ponovljenih podela (Tabela 10) već pokazuju da su ranije, jednom-podelom-zasnovane tvrdnje o poboljšanju u odnosu na bazni model bile artefakt konkretne podele; preostaje da se proveri da li i sama PSO optimizacija, kada se ponovi preko više semena, dosledno pronalazi hiperparametre koji generalizuju bolje od podrazumevanih.</w:t>
       </w:r>
     </w:p>
     <w:p>

</xml_diff>